<commit_message>
LED 10m and 2 nets with real specs
</commit_message>
<xml_diff>
--- a/thanksgiving-2026/온세대추수감사예배-기획안.docx
+++ b/thanksgiving-2026/온세대추수감사예배-기획안.docx
@@ -1037,10 +1037,15 @@
         <w:spacing w:after="80"/>
       </w:pPr>
       <w:r>
-        <w:rPr>
-          <w:b w:val="0"/>
-        </w:rPr>
-        <w:t>- 그물 이동·십자가 점등 리허설 (D-1주, LED 로프 + 자석 클립)</w:t>
+        <w:t>- 그물 이동·십자가 점등 리허설 (D-1주, LED 줄 10m(2바퀴) + 자석 클립)</w:t>
+      </w:r>
+    </w:p>
+    <w:p>
+      <w:pPr>
+        <w:spacing w:after="80"/>
+      </w:pPr>
+      <w:r>
+        <w:t>- 알리 자재 즉시 주문 (배송 2~4주): DC 5V COB USB LED 줄 웜화이트 10m(약 11,900원), 면 그물망 2×4m 2개(1개 사용+1개 예비·포토존 재활용)</w:t>
       </w:r>
     </w:p>
     <w:p>

</xml_diff>

<commit_message>
Net 1-vs-2 layout diagrams with dimensions
</commit_message>
<xml_diff>
--- a/thanksgiving-2026/온세대추수감사예배-기획안.docx
+++ b/thanksgiving-2026/온세대추수감사예배-기획안.docx
@@ -1046,6 +1046,22 @@
       </w:pPr>
       <w:r>
         <w:t>- 알리 자재 즉시 주문 (배송 2~4주): DC 5V COB USB LED 줄 웜화이트 10m(약 11,900원), 면 그물망 2×4m 2개(1개 사용+1개 예비·포토존 재활용)</w:t>
+      </w:r>
+    </w:p>
+    <w:p>
+      <w:pPr>
+        <w:spacing w:after="80"/>
+      </w:pPr>
+      <w:r>
+        <w:t>- 그물 1장안: 4,000×2,000mm, 약 300장 수용 (400명 기준 부족)</w:t>
+      </w:r>
+    </w:p>
+    <w:p>
+      <w:pPr>
+        <w:spacing w:after="80"/>
+      </w:pPr>
+      <w:r>
+        <w:t>- 그물 2장안: 5,000×2,000mm 나란히 주름 배치, 약 380장 수용 (현수막 너비 맞춤, 권장)</w:t>
       </w:r>
     </w:p>
     <w:p>

</xml_diff>

<commit_message>
Portrait fish cards and 2x2 net layout
</commit_message>
<xml_diff>
--- a/thanksgiving-2026/온세대추수감사예배-기획안.docx
+++ b/thanksgiving-2026/온세대추수감사예배-기획안.docx
@@ -1046,6 +1046,38 @@
       </w:pPr>
       <w:r>
         <w:t>- 알리 자재 즉시 주문 (배송 2~4주): DC 5V COB USB LED 줄 웜화이트 10m(약 11,900원), 면 그물망 2×4m 2개(1개 사용+1개 예비·포토존 재활용)</w:t>
+      </w:r>
+    </w:p>
+    <w:p>
+      <w:pPr>
+        <w:spacing w:after="80"/>
+      </w:pPr>
+      <w:r>
+        <w:t>- 그물 1장안: 4,000×2,000mm, 약 290장 수용 (400명 기준 부족)</w:t>
+      </w:r>
+    </w:p>
+    <w:p>
+      <w:pPr>
+        <w:spacing w:after="80"/>
+      </w:pPr>
+      <w:r>
+        <w:t>- 그물 2장안: 5,000×2,000mm 나란히 주름 배치, 약 380장 수용 (현수막 너비 맞춤, 권장)</w:t>
+      </w:r>
+    </w:p>
+    <w:p>
+      <w:pPr>
+        <w:spacing w:after="80"/>
+      </w:pPr>
+      <w:r>
+        <w:t>- 그물 2×2안: 8,000×4,000mm 4장 연결, 약 1,270장 수용 (대형 옵션, 높이 4m 리깅 필요)</w:t>
+      </w:r>
+    </w:p>
+    <w:p>
+      <w:pPr>
+        <w:spacing w:after="80"/>
+      </w:pPr>
+      <w:r>
+        <w:t>- 물고기 엽서: A4 1/4 세로형 105×148mm, 세로로 길게 매달기</w:t>
       </w:r>
     </w:p>
     <w:p>

</xml_diff>

<commit_message>
Vertical nets with per-case cross and LED lengths
</commit_message>
<xml_diff>
--- a/thanksgiving-2026/온세대추수감사예배-기획안.docx
+++ b/thanksgiving-2026/온세대추수감사예배-기획안.docx
@@ -1053,7 +1053,7 @@
         <w:spacing w:after="80"/>
       </w:pPr>
       <w:r>
-        <w:t>- 그물 1장안: 4,000×2,000mm, 약 290장 수용 (400명 기준 부족)</w:t>
+        <w:t>- 그물 1장안: 2,000×4,000mm 세로 1장, 약 240장 수용 (400명 기준 부족)</w:t>
       </w:r>
     </w:p>
     <w:p>
@@ -1061,7 +1061,7 @@
         <w:spacing w:after="80"/>
       </w:pPr>
       <w:r>
-        <w:t>- 그물 2장안: 5,000×2,000mm 나란히 주름 배치, 약 380장 수용 (현수막 너비 맞춤, 권장)</w:t>
+        <w:t>- 그물 2장안: 4,000×4,000mm 세로 2장 나란히, 약 550장 수용 (권장)</w:t>
       </w:r>
     </w:p>
     <w:p>
@@ -1069,7 +1069,7 @@
         <w:spacing w:after="80"/>
       </w:pPr>
       <w:r>
-        <w:t>- 그물 2×2안: 8,000×4,000mm 4장 연결, 약 1,270장 수용 (대형 옵션, 높이 4m 리깅 필요)</w:t>
+        <w:t>- 그물 2×2안: 4,000×8,000mm 세로 4장 연결, 약 1,090장 수용 (대형 비교용, 높이 리깅 별도)</w:t>
       </w:r>
     </w:p>
     <w:p>
@@ -1078,22 +1078,6 @@
       </w:pPr>
       <w:r>
         <w:t>- 물고기 엽서: A4 1/4 세로형 105×148mm, 세로로 길게 매달기</w:t>
-      </w:r>
-    </w:p>
-    <w:p>
-      <w:pPr>
-        <w:spacing w:after="80"/>
-      </w:pPr>
-      <w:r>
-        <w:t>- 그물 1장안: 4,000×2,000mm, 약 300장 수용 (400명 기준 부족)</w:t>
-      </w:r>
-    </w:p>
-    <w:p>
-      <w:pPr>
-        <w:spacing w:after="80"/>
-      </w:pPr>
-      <w:r>
-        <w:t>- 그물 2장안: 5,000×2,000mm 나란히 주름 배치, 약 380장 수용 (현수막 너비 맞춤, 권장)</w:t>
       </w:r>
     </w:p>
     <w:p>

</xml_diff>

<commit_message>
1-net final plan for entrance opening
</commit_message>
<xml_diff>
--- a/thanksgiving-2026/온세대추수감사예배-기획안.docx
+++ b/thanksgiving-2026/온세대추수감사예배-기획안.docx
@@ -1053,7 +1053,7 @@
         <w:spacing w:after="80"/>
       </w:pPr>
       <w:r>
-        <w:t>- 그물 1장안: 2,000×4,000mm 세로 1장, 약 240장 수용 (400명 기준 부족)</w:t>
+        <w:t>- 그물 1장안 확정: 4,000×2,000mm(입구 개구부 4,000×2,300 실측에 맞춤), 약 290장 수용</w:t>
       </w:r>
     </w:p>
     <w:p>
@@ -1061,7 +1061,7 @@
         <w:spacing w:after="80"/>
       </w:pPr>
       <w:r>
-        <w:t>- 그물 2장안: 4,000×4,000mm 세로 2장 나란히, 약 550장 수용 (권장)</w:t>
+        <w:t>- 그물 2장안: 높이 문제로 제외 (세로 배치 시 입구 2.3m 통과 불가)</w:t>
       </w:r>
     </w:p>
     <w:p>
@@ -1069,7 +1069,7 @@
         <w:spacing w:after="80"/>
       </w:pPr>
       <w:r>
-        <w:t>- 그물 2×2안: 4,000×8,000mm 세로 4장 연결, 약 1,090장 수용 (대형 비교용, 높이 리깅 별도)</w:t>
+        <w:t>- 그물 2×2안: 제외 (대형, 입구 통과 불가)</w:t>
       </w:r>
     </w:p>
     <w:p>

</xml_diff>